<commit_message>
report generation and cart issue fix
</commit_message>
<xml_diff>
--- a/Change_Log_Template.docx
+++ b/Change_Log_Template.docx
@@ -1051,6 +1051,153 @@
           </w:p>
         </w:tc>
       </w:tr>
+      <w:tr>
+        <w:tblPrEx>
+          <w:tblCellMar>
+            <w:top w:w="0" w:type="dxa"/>
+            <w:left w:w="108" w:type="dxa"/>
+            <w:bottom w:w="0" w:type="dxa"/>
+            <w:right w:w="108" w:type="dxa"/>
+          </w:tblCellMar>
+        </w:tblPrEx>
+        <w:trPr>
+          <w:jc w:val="center"/>
+        </w:trPr>
+        <w:tc>
+          <w:tcPr>
+            <w:tcW w:w="700" w:type="dxa"/>
+            <w:shd w:val="clear" w:color="auto" w:fill="F4F6F8"/>
+          </w:tcPr>
+          <w:p>
+            <w:pPr>
+              <w:rPr>
+                <w:rFonts w:hint="default"/>
+                <w:sz w:val="19"/>
+                <w:lang w:val="en-US"/>
+              </w:rPr>
+            </w:pPr>
+            <w:r>
+              <w:rPr>
+                <w:sz w:val="19"/>
+                <w:lang w:val="en-US"/>
+              </w:rPr>
+              <w:t>2026-09-08</w:t>
+            </w:r>
+          </w:p>
+        </w:tc>
+        <w:tc>
+          <w:tcPr>
+            <w:tcW w:w="1275" w:type="dxa"/>
+            <w:shd w:val="clear" w:color="auto" w:fill="F4F6F8"/>
+          </w:tcPr>
+          <w:p>
+            <w:pPr>
+              <w:rPr>
+                <w:rFonts w:hint="default"/>
+                <w:b/>
+                <w:sz w:val="19"/>
+                <w:lang w:val="en-US"/>
+              </w:rPr>
+            </w:pPr>
+            <w:r>
+              <w:rPr>
+                <w:b/>
+                <w:sz w:val="19"/>
+                <w:lang w:val="en-US"/>
+              </w:rPr>
+              <w:t>Blocking Cart page fix (client-reported ERR_TOO_MANY_REDIRECTS) &amp; full functional QA test report</w:t>
+            </w:r>
+          </w:p>
+        </w:tc>
+        <w:tc>
+          <w:tcPr>
+            <w:tcW w:w="1539" w:type="dxa"/>
+            <w:shd w:val="clear" w:color="auto" w:fill="F4F6F8"/>
+          </w:tcPr>
+          <w:p>
+            <w:pPr>
+              <w:rPr>
+                <w:rFonts w:hint="default"/>
+                <w:sz w:val="19"/>
+                <w:lang w:val="en-US"/>
+              </w:rPr>
+            </w:pPr>
+            <w:r>
+              <w:rPr>
+                <w:sz w:val="19"/>
+                <w:lang w:val="en-US"/>
+              </w:rPr>
+              <w:t>Client reported /cart/ resulted in ERR_TOO_MANY_REDIRECTS on staging, including in a fresh incognito session, and asked for a complete functional QA pass before formal acceptance testing. Root-caused the redirect loop to a template_redirect hook in the active theme's functions.php (not the WP Exam Success plugin) that unconditionally redirected the Cart page to Checkout regardless of whether the cart had anything in it -- colliding with WooCommerce's own normal behavior of redirecting an empty checkout back to the cart, looping forever. Fixed by only redirecting to checkout when the cart actually has items. Also completed the requested full functional/QA test pass across the whole plugin and the WooCommerce booking/checkout flow, delivered as a separate 35-test-case report (Function/Test Case, Expected Result, Actual Result, Pass/Fail, Notes) covering the cart fix, checkout, minimum-participant and teacher-assignment logic, payment capture, replacement sessions, all admin screens, and plugin/gateway independence.</w:t>
+            </w:r>
+          </w:p>
+        </w:tc>
+        <w:tc>
+          <w:tcPr>
+            <w:tcW w:w="2434" w:type="dxa"/>
+            <w:shd w:val="clear" w:color="auto" w:fill="F4F6F8"/>
+          </w:tcPr>
+          <w:p>
+            <w:pPr>
+              <w:rPr>
+                <w:rFonts w:hint="default"/>
+                <w:sz w:val="19"/>
+                <w:lang w:val="en-US"/>
+              </w:rPr>
+            </w:pPr>
+            <w:r>
+              <w:rPr>
+                <w:sz w:val="19"/>
+                <w:lang w:val="en-US"/>
+              </w:rPr>
+              <w:t>wp-examsuccess-theme/functions.php (active theme file, not the WP Exam Success plugin)</w:t>
+            </w:r>
+          </w:p>
+        </w:tc>
+        <w:tc>
+          <w:tcPr>
+            <w:tcW w:w="1934" w:type="dxa"/>
+            <w:shd w:val="clear" w:color="auto" w:fill="F4F6F8"/>
+          </w:tcPr>
+          <w:p>
+            <w:pPr>
+              <w:rPr>
+                <w:rFonts w:hint="default"/>
+                <w:sz w:val="19"/>
+                <w:lang w:val="en-US"/>
+              </w:rPr>
+            </w:pPr>
+            <w:r>
+              <w:rPr>
+                <w:sz w:val="19"/>
+                <w:lang w:val="en-US"/>
+              </w:rPr>
+              <w:t>Reproduced the client's exact repro first via a direct HTTP trace, confirming the redirect loop (301 cart-&gt;checkout, 302 checkout-&gt;cart, repeating indefinitely) before making any change. Deployed the fix to staging and re-tested the identical fresh-session request: /cart/ now returns a normal 200 OK showing WooCommerce's "cart is currently empty" message, no redirect. Separately completed a full functional/QA pass covering 35 test cases across the whole plugin and the booking/checkout flow -- see the attached test report for full results (32 of 35 passed with direct live verification, 2 code-verified only, 1 not independently testable this round).</w:t>
+            </w:r>
+          </w:p>
+        </w:tc>
+        <w:tc>
+          <w:tcPr>
+            <w:tcW w:w="1465" w:type="dxa"/>
+            <w:shd w:val="clear" w:color="auto" w:fill="F4F6F8"/>
+          </w:tcPr>
+          <w:p>
+            <w:pPr>
+              <w:rPr>
+                <w:rFonts w:hint="default"/>
+                <w:sz w:val="19"/>
+                <w:lang w:val="en-US"/>
+              </w:rPr>
+            </w:pPr>
+            <w:r>
+              <w:rPr>
+                <w:sz w:val="19"/>
+                <w:lang w:val="en-US"/>
+              </w:rPr>
+              <w:t>Cart fix: done, deployed &amp; verified live. Full QA report delivered separately as WP_Exam_Success_QA_Test_Report.docx -- staging confirmed ready for client acceptance testing.</w:t>
+            </w:r>
+          </w:p>
+        </w:tc>
+      </w:tr>
     </w:tbl>
     <w:p/>
     <w:sectPr>

</xml_diff>

<commit_message>
Item 2 complete: admin notification confirmed live, proves new Settings field
The real 1-hour test invite genuinely expired; triggered the existing
expiry-sweep cron for real; confirmed via WP Mail Logging's own
recorded recipient (not assumed) that the resulting "no teacher
assigned" admin alert was sent to the exact test address saved in the
new Admin Notification Email Settings field, not the generic staging
placeholder. Session correctly stayed Unassigned throughout. Test data
cleaned up afterward.

This closes item 2 from the client's Final Verification Points
document and, at the same time, is full live proof the new Settings
field (previous commit) genuinely controls delivery, not just that it
saves. All 6 items from that document are now either complete or
correctly identified as needing one real checkout from the client
(items 3 and 4).

Co-Authored-By: Claude Sonnet 5 <noreply@anthropic.com>
</commit_message>
<xml_diff>
--- a/Change_Log_Template.docx
+++ b/Change_Log_Template.docx
@@ -1744,6 +1744,141 @@
           </w:p>
         </w:tc>
       </w:tr>
+      <w:tr>
+        <w:tblPrEx>
+          <w:tblCellMar>
+            <w:top w:w="0" w:type="dxa"/>
+            <w:left w:w="108" w:type="dxa"/>
+            <w:bottom w:w="0" w:type="dxa"/>
+            <w:right w:w="108" w:type="dxa"/>
+          </w:tblCellMar>
+        </w:tblPrEx>
+        <w:trPr>
+          <w:jc w:val="center"/>
+        </w:trPr>
+        <w:tc>
+          <w:tcPr>
+            <w:tcW w:w="700" w:type="dxa"/>
+          </w:tcPr>
+          <w:p>
+            <w:pPr>
+              <w:rPr>
+                <w:sz w:val="19"/>
+                <w:lang w:val="en-US"/>
+              </w:rPr>
+            </w:pPr>
+            <w:r>
+              <w:rPr>
+                <w:sz w:val="19"/>
+                <w:lang w:val="en-US"/>
+              </w:rPr>
+              <w:t>2026-09-10</w:t>
+            </w:r>
+          </w:p>
+        </w:tc>
+        <w:tc>
+          <w:tcPr>
+            <w:tcW w:w="1275" w:type="dxa"/>
+          </w:tcPr>
+          <w:p>
+            <w:pPr>
+              <w:rPr>
+                <w:b/>
+                <w:sz w:val="19"/>
+                <w:lang w:val="en-US"/>
+              </w:rPr>
+            </w:pPr>
+            <w:r>
+              <w:rPr>
+                <w:b/>
+                <w:sz w:val="19"/>
+                <w:lang w:val="en-US"/>
+              </w:rPr>
+              <w:t>Item 2 complete: Admin Notification after Invitation Expiry -- final result</w:t>
+            </w:r>
+          </w:p>
+        </w:tc>
+        <w:tc>
+          <w:tcPr>
+            <w:tcW w:w="1539" w:type="dxa"/>
+          </w:tcPr>
+          <w:p>
+            <w:pPr>
+              <w:rPr>
+                <w:sz w:val="19"/>
+                <w:lang w:val="en-US"/>
+              </w:rPr>
+            </w:pPr>
+            <w:r>
+              <w:rPr>
+                <w:sz w:val="19"/>
+                <w:lang w:val="en-US"/>
+              </w:rPr>
+              <w:t>The real test invite created earlier (with a temporarily-shortened 1-hour expiry, the client's own suggested testing approach) genuinely expired at the real clock time. Triggered the existing expiry-sweep cron job for real immediately afterward. Confirmed directly in the mail log that a new alert fired at exactly the right moment, subject Action required: no teacher assigned, and -- checked via the mail log's own recorded recipient, not assumed -- it was sent to the exact test address saved in the new Admin Notification Email Settings field, not the generic staging placeholder inbox. This is full live proof of two things at once: the admin notification genuinely fires and is received (item 2, complete), and the new Settings field genuinely controls where it goes, not just that it saves. Confirmed the test session correctly remained Unassigned throughout, since nobody ever accepted the invite. Test session archived and the test email address reset back to blank afterward, so the client's own real address is what gets saved next. All 6 items from the Final Verification Points document are now either complete or correctly identified as needing one real checkout from the client (items 3 and 4).</w:t>
+            </w:r>
+          </w:p>
+        </w:tc>
+        <w:tc>
+          <w:tcPr>
+            <w:tcW w:w="2434" w:type="dxa"/>
+          </w:tcPr>
+          <w:p>
+            <w:pPr>
+              <w:rPr>
+                <w:sz w:val="19"/>
+                <w:lang w:val="en-US"/>
+              </w:rPr>
+            </w:pPr>
+            <w:r>
+              <w:rPr>
+                <w:sz w:val="19"/>
+                <w:lang w:val="en-US"/>
+              </w:rPr>
+              <w:t>None (result of already-deployed code from the 17:35 UTC entry).</w:t>
+            </w:r>
+          </w:p>
+        </w:tc>
+        <w:tc>
+          <w:tcPr>
+            <w:tcW w:w="1934" w:type="dxa"/>
+          </w:tcPr>
+          <w:p>
+            <w:pPr>
+              <w:rPr>
+                <w:sz w:val="19"/>
+                <w:lang w:val="en-US"/>
+              </w:rPr>
+            </w:pPr>
+            <w:r>
+              <w:rPr>
+                <w:sz w:val="19"/>
+                <w:lang w:val="en-US"/>
+              </w:rPr>
+              <w:t>Verified directly against WP Mail Logging's own recorded data for the actual email sent -- real recipient, real subject, real timestamp, not inferred. Session status re-checked afterward and confirmed correct.</w:t>
+            </w:r>
+          </w:p>
+        </w:tc>
+        <w:tc>
+          <w:tcPr>
+            <w:tcW w:w="1465" w:type="dxa"/>
+          </w:tcPr>
+          <w:p>
+            <w:pPr>
+              <w:rPr>
+                <w:sz w:val="19"/>
+                <w:lang w:val="en-US"/>
+              </w:rPr>
+            </w:pPr>
+            <w:r>
+              <w:rPr>
+                <w:sz w:val="19"/>
+                <w:lang w:val="en-US"/>
+              </w:rPr>
+              <w:t>Done, fully verified live. Item 2 closed. Items 3 and 4 remain the only outstanding points -- both need manual capture switched back on plus one or two real test-mode checkouts from the client.</w:t>
+            </w:r>
+          </w:p>
+        </w:tc>
+      </w:tr>
     </w:tbl>
     <w:p/>
     <w:sectPr>
@@ -2002,10 +2137,10 @@
     <w:lsdException w:uiPriority="99" w:name="endnote reference"/>
     <w:lsdException w:uiPriority="99" w:name="endnote text"/>
     <w:lsdException w:uiPriority="99" w:name="table of authorities"/>
-    <w:lsdException w:uiPriority="99" w:semiHidden="0" w:name="macro"/>
+    <w:lsdException w:qFormat="1" w:uiPriority="99" w:semiHidden="0" w:name="macro"/>
     <w:lsdException w:uiPriority="99" w:name="toa heading"/>
     <w:lsdException w:qFormat="1" w:uiPriority="99" w:semiHidden="0" w:name="List"/>
-    <w:lsdException w:uiPriority="99" w:semiHidden="0" w:name="List Bullet"/>
+    <w:lsdException w:qFormat="1" w:uiPriority="99" w:semiHidden="0" w:name="List Bullet"/>
     <w:lsdException w:uiPriority="99" w:semiHidden="0" w:name="List Number"/>
     <w:lsdException w:qFormat="1" w:uiPriority="99" w:semiHidden="0" w:name="List 2"/>
     <w:lsdException w:uiPriority="99" w:semiHidden="0" w:name="List 3"/>
@@ -2026,8 +2161,8 @@
     <w:lsdException w:qFormat="1" w:uiPriority="99" w:semiHidden="0" w:name="Body Text"/>
     <w:lsdException w:uiPriority="99" w:name="Body Text Indent"/>
     <w:lsdException w:uiPriority="99" w:semiHidden="0" w:name="List Continue"/>
-    <w:lsdException w:uiPriority="99" w:semiHidden="0" w:name="List Continue 2"/>
-    <w:lsdException w:uiPriority="99" w:semiHidden="0" w:name="List Continue 3"/>
+    <w:lsdException w:qFormat="1" w:uiPriority="99" w:semiHidden="0" w:name="List Continue 2"/>
+    <w:lsdException w:qFormat="1" w:uiPriority="99" w:semiHidden="0" w:name="List Continue 3"/>
     <w:lsdException w:uiPriority="99" w:name="List Continue 4"/>
     <w:lsdException w:uiPriority="99" w:name="List Continue 5"/>
     <w:lsdException w:uiPriority="99" w:name="Message Header"/>
@@ -2112,8 +2247,8 @@
     <w:lsdException w:unhideWhenUsed="0" w:uiPriority="61" w:semiHidden="0" w:name="Light List"/>
     <w:lsdException w:unhideWhenUsed="0" w:uiPriority="62" w:semiHidden="0" w:name="Light Grid"/>
     <w:lsdException w:qFormat="1" w:unhideWhenUsed="0" w:uiPriority="63" w:semiHidden="0" w:name="Medium Shading 1"/>
-    <w:lsdException w:unhideWhenUsed="0" w:uiPriority="64" w:semiHidden="0" w:name="Medium Shading 2"/>
-    <w:lsdException w:unhideWhenUsed="0" w:uiPriority="65" w:semiHidden="0" w:name="Medium List 1"/>
+    <w:lsdException w:qFormat="1" w:unhideWhenUsed="0" w:uiPriority="64" w:semiHidden="0" w:name="Medium Shading 2"/>
+    <w:lsdException w:qFormat="1" w:unhideWhenUsed="0" w:uiPriority="65" w:semiHidden="0" w:name="Medium List 1"/>
     <w:lsdException w:unhideWhenUsed="0" w:uiPriority="66" w:semiHidden="0" w:name="Medium List 2"/>
     <w:lsdException w:unhideWhenUsed="0" w:uiPriority="67" w:semiHidden="0" w:name="Medium Grid 1"/>
     <w:lsdException w:unhideWhenUsed="0" w:uiPriority="68" w:semiHidden="0" w:name="Medium Grid 2"/>
@@ -2125,9 +2260,9 @@
     <w:lsdException w:qFormat="1" w:unhideWhenUsed="0" w:uiPriority="60" w:semiHidden="0" w:name="Light Shading Accent 1"/>
     <w:lsdException w:unhideWhenUsed="0" w:uiPriority="61" w:semiHidden="0" w:name="Light List Accent 1"/>
     <w:lsdException w:unhideWhenUsed="0" w:uiPriority="62" w:semiHidden="0" w:name="Light Grid Accent 1"/>
-    <w:lsdException w:unhideWhenUsed="0" w:uiPriority="63" w:semiHidden="0" w:name="Medium Shading 1 Accent 1"/>
-    <w:lsdException w:unhideWhenUsed="0" w:uiPriority="64" w:semiHidden="0" w:name="Medium Shading 2 Accent 1"/>
-    <w:lsdException w:unhideWhenUsed="0" w:uiPriority="65" w:semiHidden="0" w:name="Medium List 1 Accent 1"/>
+    <w:lsdException w:qFormat="1" w:unhideWhenUsed="0" w:uiPriority="63" w:semiHidden="0" w:name="Medium Shading 1 Accent 1"/>
+    <w:lsdException w:qFormat="1" w:unhideWhenUsed="0" w:uiPriority="64" w:semiHidden="0" w:name="Medium Shading 2 Accent 1"/>
+    <w:lsdException w:qFormat="1" w:unhideWhenUsed="0" w:uiPriority="65" w:semiHidden="0" w:name="Medium List 1 Accent 1"/>
     <w:lsdException w:qFormat="1" w:unhideWhenUsed="0" w:uiPriority="34" w:semiHidden="0" w:name="List Paragraph"/>
     <w:lsdException w:qFormat="1" w:unhideWhenUsed="0" w:uiPriority="29" w:semiHidden="0" w:name="Quote"/>
     <w:lsdException w:qFormat="1" w:unhideWhenUsed="0" w:uiPriority="30" w:semiHidden="0" w:name="Intense Quote"/>
@@ -2142,9 +2277,9 @@
     <w:lsdException w:unhideWhenUsed="0" w:uiPriority="60" w:semiHidden="0" w:name="Light Shading Accent 2"/>
     <w:lsdException w:unhideWhenUsed="0" w:uiPriority="61" w:semiHidden="0" w:name="Light List Accent 2"/>
     <w:lsdException w:unhideWhenUsed="0" w:uiPriority="62" w:semiHidden="0" w:name="Light Grid Accent 2"/>
-    <w:lsdException w:unhideWhenUsed="0" w:uiPriority="63" w:semiHidden="0" w:name="Medium Shading 1 Accent 2"/>
-    <w:lsdException w:unhideWhenUsed="0" w:uiPriority="64" w:semiHidden="0" w:name="Medium Shading 2 Accent 2"/>
-    <w:lsdException w:unhideWhenUsed="0" w:uiPriority="65" w:semiHidden="0" w:name="Medium List 1 Accent 2"/>
+    <w:lsdException w:qFormat="1" w:unhideWhenUsed="0" w:uiPriority="63" w:semiHidden="0" w:name="Medium Shading 1 Accent 2"/>
+    <w:lsdException w:qFormat="1" w:unhideWhenUsed="0" w:uiPriority="64" w:semiHidden="0" w:name="Medium Shading 2 Accent 2"/>
+    <w:lsdException w:qFormat="1" w:unhideWhenUsed="0" w:uiPriority="65" w:semiHidden="0" w:name="Medium List 1 Accent 2"/>
     <w:lsdException w:unhideWhenUsed="0" w:uiPriority="66" w:semiHidden="0" w:name="Medium List 2 Accent 2"/>
     <w:lsdException w:qFormat="1" w:unhideWhenUsed="0" w:uiPriority="67" w:semiHidden="0" w:name="Medium Grid 1 Accent 2"/>
     <w:lsdException w:unhideWhenUsed="0" w:uiPriority="68" w:semiHidden="0" w:name="Medium Grid 2 Accent 2"/>
@@ -2156,22 +2291,22 @@
     <w:lsdException w:unhideWhenUsed="0" w:uiPriority="60" w:semiHidden="0" w:name="Light Shading Accent 3"/>
     <w:lsdException w:unhideWhenUsed="0" w:uiPriority="61" w:semiHidden="0" w:name="Light List Accent 3"/>
     <w:lsdException w:unhideWhenUsed="0" w:uiPriority="62" w:semiHidden="0" w:name="Light Grid Accent 3"/>
-    <w:lsdException w:unhideWhenUsed="0" w:uiPriority="63" w:semiHidden="0" w:name="Medium Shading 1 Accent 3"/>
-    <w:lsdException w:unhideWhenUsed="0" w:uiPriority="64" w:semiHidden="0" w:name="Medium Shading 2 Accent 3"/>
-    <w:lsdException w:unhideWhenUsed="0" w:uiPriority="65" w:semiHidden="0" w:name="Medium List 1 Accent 3"/>
+    <w:lsdException w:qFormat="1" w:unhideWhenUsed="0" w:uiPriority="63" w:semiHidden="0" w:name="Medium Shading 1 Accent 3"/>
+    <w:lsdException w:qFormat="1" w:unhideWhenUsed="0" w:uiPriority="64" w:semiHidden="0" w:name="Medium Shading 2 Accent 3"/>
+    <w:lsdException w:qFormat="1" w:unhideWhenUsed="0" w:uiPriority="65" w:semiHidden="0" w:name="Medium List 1 Accent 3"/>
     <w:lsdException w:unhideWhenUsed="0" w:uiPriority="66" w:semiHidden="0" w:name="Medium List 2 Accent 3"/>
     <w:lsdException w:unhideWhenUsed="0" w:uiPriority="67" w:semiHidden="0" w:name="Medium Grid 1 Accent 3"/>
     <w:lsdException w:unhideWhenUsed="0" w:uiPriority="68" w:semiHidden="0" w:name="Medium Grid 2 Accent 3"/>
     <w:lsdException w:unhideWhenUsed="0" w:uiPriority="69" w:semiHidden="0" w:name="Medium Grid 3 Accent 3"/>
-    <w:lsdException w:unhideWhenUsed="0" w:uiPriority="70" w:semiHidden="0" w:name="Dark List Accent 3"/>
+    <w:lsdException w:qFormat="1" w:unhideWhenUsed="0" w:uiPriority="70" w:semiHidden="0" w:name="Dark List Accent 3"/>
     <w:lsdException w:qFormat="1" w:unhideWhenUsed="0" w:uiPriority="71" w:semiHidden="0" w:name="Colorful Shading Accent 3"/>
     <w:lsdException w:qFormat="1" w:unhideWhenUsed="0" w:uiPriority="72" w:semiHidden="0" w:name="Colorful List Accent 3"/>
     <w:lsdException w:unhideWhenUsed="0" w:uiPriority="73" w:semiHidden="0" w:name="Colorful Grid Accent 3"/>
     <w:lsdException w:unhideWhenUsed="0" w:uiPriority="60" w:semiHidden="0" w:name="Light Shading Accent 4"/>
     <w:lsdException w:unhideWhenUsed="0" w:uiPriority="61" w:semiHidden="0" w:name="Light List Accent 4"/>
     <w:lsdException w:unhideWhenUsed="0" w:uiPriority="62" w:semiHidden="0" w:name="Light Grid Accent 4"/>
-    <w:lsdException w:unhideWhenUsed="0" w:uiPriority="63" w:semiHidden="0" w:name="Medium Shading 1 Accent 4"/>
-    <w:lsdException w:unhideWhenUsed="0" w:uiPriority="64" w:semiHidden="0" w:name="Medium Shading 2 Accent 4"/>
+    <w:lsdException w:qFormat="1" w:unhideWhenUsed="0" w:uiPriority="63" w:semiHidden="0" w:name="Medium Shading 1 Accent 4"/>
+    <w:lsdException w:qFormat="1" w:unhideWhenUsed="0" w:uiPriority="64" w:semiHidden="0" w:name="Medium Shading 2 Accent 4"/>
     <w:lsdException w:unhideWhenUsed="0" w:uiPriority="65" w:semiHidden="0" w:name="Medium List 1 Accent 4"/>
     <w:lsdException w:unhideWhenUsed="0" w:uiPriority="66" w:semiHidden="0" w:name="Medium List 2 Accent 4"/>
     <w:lsdException w:unhideWhenUsed="0" w:uiPriority="67" w:semiHidden="0" w:name="Medium Grid 1 Accent 4"/>
@@ -2183,9 +2318,9 @@
     <w:lsdException w:unhideWhenUsed="0" w:uiPriority="73" w:semiHidden="0" w:name="Colorful Grid Accent 4"/>
     <w:lsdException w:unhideWhenUsed="0" w:uiPriority="60" w:semiHidden="0" w:name="Light Shading Accent 5"/>
     <w:lsdException w:unhideWhenUsed="0" w:uiPriority="61" w:semiHidden="0" w:name="Light List Accent 5"/>
-    <w:lsdException w:unhideWhenUsed="0" w:uiPriority="62" w:semiHidden="0" w:name="Light Grid Accent 5"/>
-    <w:lsdException w:unhideWhenUsed="0" w:uiPriority="63" w:semiHidden="0" w:name="Medium Shading 1 Accent 5"/>
-    <w:lsdException w:unhideWhenUsed="0" w:uiPriority="64" w:semiHidden="0" w:name="Medium Shading 2 Accent 5"/>
+    <w:lsdException w:qFormat="1" w:unhideWhenUsed="0" w:uiPriority="62" w:semiHidden="0" w:name="Light Grid Accent 5"/>
+    <w:lsdException w:qFormat="1" w:unhideWhenUsed="0" w:uiPriority="63" w:semiHidden="0" w:name="Medium Shading 1 Accent 5"/>
+    <w:lsdException w:qFormat="1" w:unhideWhenUsed="0" w:uiPriority="64" w:semiHidden="0" w:name="Medium Shading 2 Accent 5"/>
     <w:lsdException w:unhideWhenUsed="0" w:uiPriority="65" w:semiHidden="0" w:name="Medium List 1 Accent 5"/>
     <w:lsdException w:unhideWhenUsed="0" w:uiPriority="66" w:semiHidden="0" w:name="Medium List 2 Accent 5"/>
     <w:lsdException w:unhideWhenUsed="0" w:uiPriority="67" w:semiHidden="0" w:name="Medium Grid 1 Accent 5"/>
@@ -2197,14 +2332,14 @@
     <w:lsdException w:qFormat="1" w:unhideWhenUsed="0" w:uiPriority="73" w:semiHidden="0" w:name="Colorful Grid Accent 5"/>
     <w:lsdException w:unhideWhenUsed="0" w:uiPriority="60" w:semiHidden="0" w:name="Light Shading Accent 6"/>
     <w:lsdException w:unhideWhenUsed="0" w:uiPriority="61" w:semiHidden="0" w:name="Light List Accent 6"/>
-    <w:lsdException w:unhideWhenUsed="0" w:uiPriority="62" w:semiHidden="0" w:name="Light Grid Accent 6"/>
-    <w:lsdException w:unhideWhenUsed="0" w:uiPriority="63" w:semiHidden="0" w:name="Medium Shading 1 Accent 6"/>
-    <w:lsdException w:unhideWhenUsed="0" w:uiPriority="64" w:semiHidden="0" w:name="Medium Shading 2 Accent 6"/>
+    <w:lsdException w:qFormat="1" w:unhideWhenUsed="0" w:uiPriority="62" w:semiHidden="0" w:name="Light Grid Accent 6"/>
+    <w:lsdException w:qFormat="1" w:unhideWhenUsed="0" w:uiPriority="63" w:semiHidden="0" w:name="Medium Shading 1 Accent 6"/>
+    <w:lsdException w:qFormat="1" w:unhideWhenUsed="0" w:uiPriority="64" w:semiHidden="0" w:name="Medium Shading 2 Accent 6"/>
     <w:lsdException w:unhideWhenUsed="0" w:uiPriority="65" w:semiHidden="0" w:name="Medium List 1 Accent 6"/>
     <w:lsdException w:unhideWhenUsed="0" w:uiPriority="66" w:semiHidden="0" w:name="Medium List 2 Accent 6"/>
     <w:lsdException w:unhideWhenUsed="0" w:uiPriority="67" w:semiHidden="0" w:name="Medium Grid 1 Accent 6"/>
     <w:lsdException w:unhideWhenUsed="0" w:uiPriority="68" w:semiHidden="0" w:name="Medium Grid 2 Accent 6"/>
-    <w:lsdException w:unhideWhenUsed="0" w:uiPriority="69" w:semiHidden="0" w:name="Medium Grid 3 Accent 6"/>
+    <w:lsdException w:qFormat="1" w:unhideWhenUsed="0" w:uiPriority="69" w:semiHidden="0" w:name="Medium Grid 3 Accent 6"/>
     <w:lsdException w:qFormat="1" w:unhideWhenUsed="0" w:uiPriority="70" w:semiHidden="0" w:name="Dark List Accent 6"/>
     <w:lsdException w:qFormat="1" w:unhideWhenUsed="0" w:uiPriority="71" w:semiHidden="0" w:name="Colorful Shading Accent 6"/>
     <w:lsdException w:qFormat="1" w:unhideWhenUsed="0" w:uiPriority="72" w:semiHidden="0" w:name="Colorful List Accent 6"/>
@@ -2620,6 +2755,7 @@
     <w:name w:val="List Bullet"/>
     <w:basedOn w:val="1"/>
     <w:unhideWhenUsed/>
+    <w:qFormat/>
     <w:uiPriority w:val="99"/>
     <w:pPr>
       <w:numPr>
@@ -2672,6 +2808,7 @@
     <w:name w:val="List Continue 2"/>
     <w:basedOn w:val="1"/>
     <w:unhideWhenUsed/>
+    <w:qFormat/>
     <w:uiPriority w:val="99"/>
     <w:pPr>
       <w:spacing w:after="120"/>
@@ -2683,6 +2820,7 @@
     <w:name w:val="List Continue 3"/>
     <w:basedOn w:val="1"/>
     <w:unhideWhenUsed/>
+    <w:qFormat/>
     <w:uiPriority w:val="99"/>
     <w:pPr>
       <w:spacing w:after="120"/>
@@ -2735,6 +2873,7 @@
     <w:name w:val="macro"/>
     <w:link w:val="147"/>
     <w:unhideWhenUsed/>
+    <w:qFormat/>
     <w:uiPriority w:val="99"/>
     <w:pPr>
       <w:tabs>
@@ -4694,6 +4833,7 @@
   <w:style w:type="table" w:styleId="56">
     <w:name w:val="Light Grid Accent 5"/>
     <w:basedOn w:val="12"/>
+    <w:qFormat/>
     <w:uiPriority w:val="62"/>
     <w:pPr>
       <w:spacing w:after="0" w:line="240" w:lineRule="auto"/>
@@ -4814,6 +4954,7 @@
   <w:style w:type="table" w:styleId="57">
     <w:name w:val="Light Grid Accent 6"/>
     <w:basedOn w:val="12"/>
+    <w:qFormat/>
     <w:uiPriority w:val="62"/>
     <w:pPr>
       <w:spacing w:after="0" w:line="240" w:lineRule="auto"/>
@@ -5036,6 +5177,7 @@
   <w:style w:type="table" w:styleId="59">
     <w:name w:val="Medium Shading 1 Accent 1"/>
     <w:basedOn w:val="12"/>
+    <w:qFormat/>
     <w:uiPriority w:val="63"/>
     <w:pPr>
       <w:spacing w:after="0" w:line="240" w:lineRule="auto"/>
@@ -5137,6 +5279,7 @@
   <w:style w:type="table" w:styleId="60">
     <w:name w:val="Medium Shading 1 Accent 2"/>
     <w:basedOn w:val="12"/>
+    <w:qFormat/>
     <w:uiPriority w:val="63"/>
     <w:pPr>
       <w:spacing w:after="0" w:line="240" w:lineRule="auto"/>
@@ -5238,6 +5381,7 @@
   <w:style w:type="table" w:styleId="61">
     <w:name w:val="Medium Shading 1 Accent 3"/>
     <w:basedOn w:val="12"/>
+    <w:qFormat/>
     <w:uiPriority w:val="63"/>
     <w:pPr>
       <w:spacing w:after="0" w:line="240" w:lineRule="auto"/>
@@ -5339,6 +5483,7 @@
   <w:style w:type="table" w:styleId="62">
     <w:name w:val="Medium Shading 1 Accent 4"/>
     <w:basedOn w:val="12"/>
+    <w:qFormat/>
     <w:uiPriority w:val="63"/>
     <w:pPr>
       <w:spacing w:after="0" w:line="240" w:lineRule="auto"/>
@@ -5440,6 +5585,7 @@
   <w:style w:type="table" w:styleId="63">
     <w:name w:val="Medium Shading 1 Accent 5"/>
     <w:basedOn w:val="12"/>
+    <w:qFormat/>
     <w:uiPriority w:val="63"/>
     <w:pPr>
       <w:spacing w:after="0" w:line="240" w:lineRule="auto"/>
@@ -5541,6 +5687,7 @@
   <w:style w:type="table" w:styleId="64">
     <w:name w:val="Medium Shading 1 Accent 6"/>
     <w:basedOn w:val="12"/>
+    <w:qFormat/>
     <w:uiPriority w:val="63"/>
     <w:pPr>
       <w:spacing w:after="0" w:line="240" w:lineRule="auto"/>
@@ -5642,6 +5789,7 @@
   <w:style w:type="table" w:styleId="65">
     <w:name w:val="Medium Shading 2"/>
     <w:basedOn w:val="12"/>
+    <w:qFormat/>
     <w:uiPriority w:val="64"/>
     <w:pPr>
       <w:spacing w:after="0" w:line="240" w:lineRule="auto"/>
@@ -5801,6 +5949,7 @@
   <w:style w:type="table" w:styleId="66">
     <w:name w:val="Medium Shading 2 Accent 1"/>
     <w:basedOn w:val="12"/>
+    <w:qFormat/>
     <w:uiPriority w:val="64"/>
     <w:pPr>
       <w:spacing w:after="0" w:line="240" w:lineRule="auto"/>
@@ -5960,6 +6109,7 @@
   <w:style w:type="table" w:styleId="67">
     <w:name w:val="Medium Shading 2 Accent 2"/>
     <w:basedOn w:val="12"/>
+    <w:qFormat/>
     <w:uiPriority w:val="64"/>
     <w:pPr>
       <w:spacing w:after="0" w:line="240" w:lineRule="auto"/>
@@ -6119,6 +6269,7 @@
   <w:style w:type="table" w:styleId="68">
     <w:name w:val="Medium Shading 2 Accent 3"/>
     <w:basedOn w:val="12"/>
+    <w:qFormat/>
     <w:uiPriority w:val="64"/>
     <w:pPr>
       <w:spacing w:after="0" w:line="240" w:lineRule="auto"/>
@@ -6278,6 +6429,7 @@
   <w:style w:type="table" w:styleId="69">
     <w:name w:val="Medium Shading 2 Accent 4"/>
     <w:basedOn w:val="12"/>
+    <w:qFormat/>
     <w:uiPriority w:val="64"/>
     <w:pPr>
       <w:spacing w:after="0" w:line="240" w:lineRule="auto"/>
@@ -6437,6 +6589,7 @@
   <w:style w:type="table" w:styleId="70">
     <w:name w:val="Medium Shading 2 Accent 5"/>
     <w:basedOn w:val="12"/>
+    <w:qFormat/>
     <w:uiPriority w:val="64"/>
     <w:pPr>
       <w:spacing w:after="0" w:line="240" w:lineRule="auto"/>
@@ -6596,6 +6749,7 @@
   <w:style w:type="table" w:styleId="71">
     <w:name w:val="Medium Shading 2 Accent 6"/>
     <w:basedOn w:val="12"/>
+    <w:qFormat/>
     <w:uiPriority w:val="64"/>
     <w:pPr>
       <w:spacing w:after="0" w:line="240" w:lineRule="auto"/>
@@ -6755,6 +6909,7 @@
   <w:style w:type="table" w:styleId="72">
     <w:name w:val="Medium List 1"/>
     <w:basedOn w:val="12"/>
+    <w:qFormat/>
     <w:uiPriority w:val="65"/>
     <w:pPr>
       <w:spacing w:after="0" w:line="240" w:lineRule="auto"/>
@@ -6839,6 +6994,7 @@
   <w:style w:type="table" w:styleId="73">
     <w:name w:val="Medium List 1 Accent 1"/>
     <w:basedOn w:val="12"/>
+    <w:qFormat/>
     <w:uiPriority w:val="65"/>
     <w:pPr>
       <w:spacing w:after="0" w:line="240" w:lineRule="auto"/>
@@ -6923,6 +7079,7 @@
   <w:style w:type="table" w:styleId="74">
     <w:name w:val="Medium List 1 Accent 2"/>
     <w:basedOn w:val="12"/>
+    <w:qFormat/>
     <w:uiPriority w:val="65"/>
     <w:pPr>
       <w:spacing w:after="0" w:line="240" w:lineRule="auto"/>
@@ -7007,6 +7164,7 @@
   <w:style w:type="table" w:styleId="75">
     <w:name w:val="Medium List 1 Accent 3"/>
     <w:basedOn w:val="12"/>
+    <w:qFormat/>
     <w:uiPriority w:val="65"/>
     <w:pPr>
       <w:spacing w:after="0" w:line="240" w:lineRule="auto"/>
@@ -10535,6 +10693,7 @@
   <w:style w:type="table" w:styleId="106">
     <w:name w:val="Medium Grid 3 Accent 6"/>
     <w:basedOn w:val="12"/>
+    <w:qFormat/>
     <w:uiPriority w:val="69"/>
     <w:pPr>
       <w:spacing w:after="0" w:line="240" w:lineRule="auto"/>
@@ -11020,6 +11179,7 @@
   <w:style w:type="table" w:styleId="110">
     <w:name w:val="Dark List Accent 3"/>
     <w:basedOn w:val="12"/>
+    <w:qFormat/>
     <w:uiPriority w:val="70"/>
     <w:pPr>
       <w:spacing w:after="0" w:line="240" w:lineRule="auto"/>

</xml_diff>